<commit_message>
docs: sync BUILD_SPEC.pdf (tie comment) + scaffold three-week fix
- BUILD_SPEC.pdf regenerated from the updated HTML so it carries the M6
  tie-break comment (parity with the HTML).
- REPORT_SCAFFOLD.docx: "first two weeks" -> three-week training phase
  (18 May - 6 Jun 2026) with the verified 12 training topics pre-filled.
</commit_message>
<xml_diff>
--- a/REPORT_SCAFFOLD.docx
+++ b/REPORT_SCAFFOLD.docx
@@ -269,7 +269,7 @@
         <w:rPr>
           <w:b/>
         </w:rPr>
-        <w:t>Also list the topics you were trained on during the first two weeks of the internship.</w:t>
+        <w:t>Also list the topics you were trained on during the three-week training phase (18 May – 6 June 2026) of the internship.</w:t>
       </w:r>
       <w:r>
         <w:br/>
@@ -313,7 +313,7 @@
         <w:rPr>
           <w:b/>
         </w:rPr>
-        <w:t>Training topics covered in the first two weeks</w:t>
+        <w:t>Training topics covered in the three-week training phase (18 May – 6 June 2026)</w:t>
       </w:r>
       <w:r>
         <w:t xml:space="preserve"> </w:t>
@@ -330,7 +330,7 @@
         <w:pStyle w:val="ListBullet"/>
       </w:pPr>
       <w:r>
-        <w:t>[Topic 1]</w:t>
+        <w:t>Basic Statistics for Data Science</w:t>
       </w:r>
     </w:p>
     <w:p>
@@ -338,7 +338,7 @@
         <w:pStyle w:val="ListBullet"/>
       </w:pPr>
       <w:r>
-        <w:t>[Topic 2]</w:t>
+        <w:t>Data Visualization</w:t>
       </w:r>
     </w:p>
     <w:p>
@@ -346,7 +346,7 @@
         <w:pStyle w:val="ListBullet"/>
       </w:pPr>
       <w:r>
-        <w:t>[Topic 3]</w:t>
+        <w:t>Introduction to GitHub and Cloud Computing</w:t>
       </w:r>
     </w:p>
     <w:p>
@@ -354,7 +354,71 @@
         <w:pStyle w:val="ListBullet"/>
       </w:pPr>
       <w:r>
-        <w:t>[...]</w:t>
+        <w:t>Data Science Application Development using Streamlit</w:t>
+      </w:r>
+    </w:p>
+    <w:p>
+      <w:pPr>
+        <w:pStyle w:val="ListBullet"/>
+      </w:pPr>
+      <w:r>
+        <w:t>Machine Learning (Parts 1 &amp; 2)</w:t>
+      </w:r>
+    </w:p>
+    <w:p>
+      <w:pPr>
+        <w:pStyle w:val="ListBullet"/>
+      </w:pPr>
+      <w:r>
+        <w:t>LLM Fundamentals</w:t>
+      </w:r>
+    </w:p>
+    <w:p>
+      <w:pPr>
+        <w:pStyle w:val="ListBullet"/>
+      </w:pPr>
+      <w:r>
+        <w:t>Communication Skills</w:t>
+      </w:r>
+    </w:p>
+    <w:p>
+      <w:pPr>
+        <w:pStyle w:val="ListBullet"/>
+      </w:pPr>
+      <w:r>
+        <w:t>Deep Learning (Parts 1 &amp; 2)</w:t>
+      </w:r>
+    </w:p>
+    <w:p>
+      <w:pPr>
+        <w:pStyle w:val="ListBullet"/>
+      </w:pPr>
+      <w:r>
+        <w:t>Computer Vision Overview</w:t>
+      </w:r>
+    </w:p>
+    <w:p>
+      <w:pPr>
+        <w:pStyle w:val="ListBullet"/>
+      </w:pPr>
+      <w:r>
+        <w:t>Agentic AI</w:t>
+      </w:r>
+    </w:p>
+    <w:p>
+      <w:pPr>
+        <w:pStyle w:val="ListBullet"/>
+      </w:pPr>
+      <w:r>
+        <w:t>System View of Data Science</w:t>
+      </w:r>
+    </w:p>
+    <w:p>
+      <w:pPr>
+        <w:pStyle w:val="ListBullet"/>
+      </w:pPr>
+      <w:r>
+        <w:t>Reinforcement Learning</w:t>
       </w:r>
     </w:p>
     <w:p>

</xml_diff>